<commit_message>
chore(release): v1.4.0 终版发布 — 版本号三处定版(package.json×2+config.py APP_VERSION), 重打 sidecar+NSIS 安装包 KMatch·知链-1.4.0-x64.exe(134.5MB); 新增软件说明/系统部署说明 v1.4.0, README·docs README·比赛资料包(md/docx/PPT)版本对齐; 项目正式收尾(devlog 收官), 代码基线与 v1.3.4 一致
</commit_message>
<xml_diff>
--- a/docs/比赛提交/exports/01_作品介绍.docx
+++ b/docs/比赛提交/exports/01_作品介绍.docx
@@ -256,7 +256,7 @@
           <w:sz w:val="32"/>
           <w:szCs w:val="32"/>
         </w:rPr>
-        <w:t xml:space="preserve">一句话介绍</w:t>
+        <w:t xml:space="preserve">介绍</w:t>
       </w:r>
     </w:p>
     <w:p>
@@ -1768,7 +1768,7 @@
                 <w:sz w:val="18"/>
                 <w:szCs w:val="18"/>
               </w:rPr>
-              <w:t xml:space="preserve">KMatch·知链-1.3.4-x64.exe</w:t>
+              <w:t xml:space="preserve">KMatch·知链-1.4.0-x64.exe</w:t>
             </w:r>
             <w:r>
               <w:rPr>

</xml_diff>